<commit_message>
This code is near completion
</commit_message>
<xml_diff>
--- a/Documents for the project/Participant Information Sheet.docx
+++ b/Documents for the project/Participant Information Sheet.docx
@@ -201,7 +201,7 @@
           <w:sz w:val="22"/>
           <w:szCs w:val="22"/>
         </w:rPr>
-        <w:t xml:space="preserve">wish. Ask me/us if there is anything that is not clear or if you would like more information. Take time to decide </w:t>
+        <w:t xml:space="preserve">wish. Ask me if there is anything that is not clear or if you would like more information. Take time to decide </w:t>
       </w:r>
       <w:r>
         <w:rPr>
@@ -346,7 +346,6 @@
         </w:rPr>
         <w:t xml:space="preserve">deliver a smarter way of detecting phishing attempts </w:t>
       </w:r>
-      <w:proofErr w:type="gramStart"/>
       <w:r>
         <w:rPr>
           <w:rFonts w:ascii="Palatino Linotype" w:hAnsi="Palatino Linotype"/>
@@ -354,9 +353,8 @@
           <w:sz w:val="22"/>
           <w:szCs w:val="22"/>
         </w:rPr>
-        <w:t>through the use of</w:t>
-      </w:r>
-      <w:proofErr w:type="gramEnd"/>
+        <w:t>using</w:t>
+      </w:r>
       <w:r>
         <w:rPr>
           <w:rFonts w:ascii="Palatino Linotype" w:hAnsi="Palatino Linotype"/>
@@ -1617,17 +1615,20 @@
           <w:sz w:val="22"/>
           <w:szCs w:val="22"/>
         </w:rPr>
-        <w:t xml:space="preserve"> Meraj Hoque -</w:t>
-      </w:r>
-      <w:r>
-        <w:rPr>
-          <w:rFonts w:ascii="Palatino Linotype" w:hAnsi="Palatino Linotype"/>
-          <w:b/>
-          <w:sz w:val="22"/>
-          <w:szCs w:val="22"/>
-        </w:rPr>
-        <w:t xml:space="preserve"> 2222491@brunel.ac.uk</w:t>
-      </w:r>
+        <w:t xml:space="preserve"> Meraj Hoque - </w:t>
+      </w:r>
+      <w:hyperlink r:id="rId11" w:history="1">
+        <w:r>
+          <w:rPr>
+            <w:rStyle w:val="Hyperlink"/>
+            <w:rFonts w:ascii="Palatino Linotype" w:hAnsi="Palatino Linotype"/>
+            <w:b/>
+            <w:sz w:val="22"/>
+            <w:szCs w:val="22"/>
+          </w:rPr>
+          <w:t>2222491@brunel.ac.uk</w:t>
+        </w:r>
+      </w:hyperlink>
     </w:p>
     <w:p>
       <w:pPr>
@@ -1635,31 +1636,10 @@
         <w:rPr>
           <w:rFonts w:ascii="Palatino Linotype" w:hAnsi="Palatino Linotype"/>
           <w:b/>
-          <w:color w:val="FF0000"/>
-          <w:sz w:val="22"/>
-          <w:szCs w:val="22"/>
-        </w:rPr>
-      </w:pPr>
-      <w:r>
-        <w:rPr>
-          <w:rFonts w:ascii="Palatino Linotype" w:hAnsi="Palatino Linotype"/>
-          <w:b/>
-          <w:color w:val="FF0000"/>
-          <w:sz w:val="22"/>
-          <w:szCs w:val="22"/>
-        </w:rPr>
-        <w:t>(If relevant)</w:t>
-      </w:r>
-      <w:r>
-        <w:rPr>
-          <w:rFonts w:ascii="Palatino Linotype" w:hAnsi="Palatino Linotype"/>
-          <w:b/>
-          <w:color w:val="FF0000"/>
-          <w:sz w:val="22"/>
-          <w:szCs w:val="22"/>
-        </w:rPr>
-        <w:t xml:space="preserve"> </w:t>
-      </w:r>
+          <w:sz w:val="22"/>
+          <w:szCs w:val="22"/>
+        </w:rPr>
+      </w:pPr>
       <w:r>
         <w:rPr>
           <w:rFonts w:ascii="Palatino Linotype" w:hAnsi="Palatino Linotype"/>
@@ -2293,6 +2273,18 @@
       <w:u w:val="single"/>
     </w:rPr>
   </w:style>
+  <w:style w:type="character" w:styleId="UnresolvedMention">
+    <w:name w:val="Unresolved Mention"/>
+    <w:basedOn w:val="DefaultParagraphFont"/>
+    <w:uiPriority w:val="99"/>
+    <w:semiHidden/>
+    <w:unhideWhenUsed/>
+    <w:rsid w:val="00AC0A62"/>
+    <w:rPr>
+      <w:color w:val="605E5C"/>
+      <w:shd w:val="clear" w:color="auto" w:fill="E1DFDD"/>
+    </w:rPr>
+  </w:style>
 </w:styles>
 </file>
 
@@ -2582,36 +2574,6 @@
 </file>
 
 <file path=customXml/item1.xml><?xml version="1.0" encoding="utf-8"?>
-<p:properties xmlns:p="http://schemas.microsoft.com/office/2006/metadata/properties" xmlns:xsi="http://www.w3.org/2001/XMLSchema-instance" xmlns:pc="http://schemas.microsoft.com/office/infopath/2007/PartnerControls">
-  <documentManagement>
-    <BrunelBaseOwner0 xmlns="e4d86ed8-65a8-471e-ab1f-c2478708fe07">
-      <Terms xmlns="http://schemas.microsoft.com/office/infopath/2007/PartnerControls">
-        <TermInfo xmlns="http://schemas.microsoft.com/office/infopath/2007/PartnerControls">
-          <TermName xmlns="http://schemas.microsoft.com/office/infopath/2007/PartnerControls">College of Engineering, Design and Physical Sciences</TermName>
-          <TermId xmlns="http://schemas.microsoft.com/office/infopath/2007/PartnerControls">c9dd3e1f-cd8c-4bec-980c-78787024c175</TermId>
-        </TermInfo>
-      </Terms>
-    </BrunelBaseOwner0>
-    <TaxCatchAll xmlns="53141595-342e-49bb-a682-90f2e9cbb543">
-      <Value>1</Value>
-    </TaxCatchAll>
-    <BrunelBaseAudience0 xmlns="e4d86ed8-65a8-471e-ab1f-c2478708fe07">
-      <Terms xmlns="http://schemas.microsoft.com/office/infopath/2007/PartnerControls"/>
-    </BrunelBaseAudience0>
-  </documentManagement>
-</p:properties>
-</file>
-
-<file path=customXml/item2.xml><?xml version="1.0" encoding="utf-8"?>
-<?mso-contentType ?>
-<FormTemplates xmlns="http://schemas.microsoft.com/sharepoint/v3/contenttype/forms">
-  <Display>DocumentLibraryForm</Display>
-  <Edit>DocumentLibraryForm</Edit>
-  <New>DocumentLibraryForm</New>
-</FormTemplates>
-</file>
-
-<file path=customXml/item3.xml><?xml version="1.0" encoding="utf-8"?>
 <ct:contentTypeSchema xmlns:ct="http://schemas.microsoft.com/office/2006/metadata/contentType" xmlns:ma="http://schemas.microsoft.com/office/2006/metadata/properties/metaAttributes" ct:_="" ma:_="" ma:contentTypeName="Brunel Document" ma:contentTypeID="0x010100B5A4C08D27C9458A8DBC831B2C0EF43F00DD051F9C57646C4FAE9957A3F0957FA1" ma:contentTypeVersion="0" ma:contentTypeDescription="This is the base type for all Brunel documents." ma:contentTypeScope="" ma:versionID="f586f7aad4b82892f9dbbceaf25713f6">
   <xsd:schema xmlns:xsd="http://www.w3.org/2001/XMLSchema" xmlns:xs="http://www.w3.org/2001/XMLSchema" xmlns:p="http://schemas.microsoft.com/office/2006/metadata/properties" xmlns:ns2="e4d86ed8-65a8-471e-ab1f-c2478708fe07" xmlns:ns3="53141595-342e-49bb-a682-90f2e9cbb543" targetNamespace="http://schemas.microsoft.com/office/2006/metadata/properties" ma:root="true" ma:fieldsID="95d7a05f316f224b1e01a0e06e8d3bbb" ns2:_="" ns3:_="">
     <xsd:import namespace="e4d86ed8-65a8-471e-ab1f-c2478708fe07"/>
@@ -2764,26 +2726,37 @@
 </ct:contentTypeSchema>
 </file>
 
-<file path=customXml/itemProps1.xml><?xml version="1.0" encoding="utf-8"?>
-<ds:datastoreItem xmlns:ds="http://schemas.openxmlformats.org/officeDocument/2006/customXml" ds:itemID="{EAD7A3D4-D669-42A5-ADDB-03D9E33DB022}">
-  <ds:schemaRefs>
-    <ds:schemaRef ds:uri="http://schemas.microsoft.com/office/2006/metadata/properties"/>
-    <ds:schemaRef ds:uri="http://schemas.microsoft.com/office/infopath/2007/PartnerControls"/>
-    <ds:schemaRef ds:uri="e4d86ed8-65a8-471e-ab1f-c2478708fe07"/>
-    <ds:schemaRef ds:uri="53141595-342e-49bb-a682-90f2e9cbb543"/>
-  </ds:schemaRefs>
-</ds:datastoreItem>
+<file path=customXml/item2.xml><?xml version="1.0" encoding="utf-8"?>
+<?mso-contentType ?>
+<FormTemplates xmlns="http://schemas.microsoft.com/sharepoint/v3/contenttype/forms">
+  <Display>DocumentLibraryForm</Display>
+  <Edit>DocumentLibraryForm</Edit>
+  <New>DocumentLibraryForm</New>
+</FormTemplates>
 </file>
 
-<file path=customXml/itemProps2.xml><?xml version="1.0" encoding="utf-8"?>
-<ds:datastoreItem xmlns:ds="http://schemas.openxmlformats.org/officeDocument/2006/customXml" ds:itemID="{FDDE65B1-EDD1-4348-B311-C32292D0D99D}">
-  <ds:schemaRefs>
-    <ds:schemaRef ds:uri="http://schemas.microsoft.com/sharepoint/v3/contenttype/forms"/>
-  </ds:schemaRefs>
-</ds:datastoreItem>
+<file path=customXml/item3.xml><?xml version="1.0" encoding="utf-8"?>
+<p:properties xmlns:p="http://schemas.microsoft.com/office/2006/metadata/properties" xmlns:xsi="http://www.w3.org/2001/XMLSchema-instance" xmlns:pc="http://schemas.microsoft.com/office/infopath/2007/PartnerControls">
+  <documentManagement>
+    <BrunelBaseOwner0 xmlns="e4d86ed8-65a8-471e-ab1f-c2478708fe07">
+      <Terms xmlns="http://schemas.microsoft.com/office/infopath/2007/PartnerControls">
+        <TermInfo xmlns="http://schemas.microsoft.com/office/infopath/2007/PartnerControls">
+          <TermName xmlns="http://schemas.microsoft.com/office/infopath/2007/PartnerControls">College of Engineering, Design and Physical Sciences</TermName>
+          <TermId xmlns="http://schemas.microsoft.com/office/infopath/2007/PartnerControls">c9dd3e1f-cd8c-4bec-980c-78787024c175</TermId>
+        </TermInfo>
+      </Terms>
+    </BrunelBaseOwner0>
+    <TaxCatchAll xmlns="53141595-342e-49bb-a682-90f2e9cbb543">
+      <Value>1</Value>
+    </TaxCatchAll>
+    <BrunelBaseAudience0 xmlns="e4d86ed8-65a8-471e-ab1f-c2478708fe07">
+      <Terms xmlns="http://schemas.microsoft.com/office/infopath/2007/PartnerControls"/>
+    </BrunelBaseAudience0>
+  </documentManagement>
+</p:properties>
 </file>
 
-<file path=customXml/itemProps3.xml><?xml version="1.0" encoding="utf-8"?>
+<file path=customXml/itemProps1.xml><?xml version="1.0" encoding="utf-8"?>
 <ds:datastoreItem xmlns:ds="http://schemas.openxmlformats.org/officeDocument/2006/customXml" ds:itemID="{50B30070-3B4F-4AE7-8A81-B6569C35DA41}">
   <ds:schemaRefs>
     <ds:schemaRef ds:uri="http://schemas.microsoft.com/office/2006/metadata/contentType"/>
@@ -2800,4 +2773,23 @@
     <ds:schemaRef ds:uri="http://schemas.microsoft.com/internal/obd"/>
   </ds:schemaRefs>
 </ds:datastoreItem>
+</file>
+
+<file path=customXml/itemProps2.xml><?xml version="1.0" encoding="utf-8"?>
+<ds:datastoreItem xmlns:ds="http://schemas.openxmlformats.org/officeDocument/2006/customXml" ds:itemID="{FDDE65B1-EDD1-4348-B311-C32292D0D99D}">
+  <ds:schemaRefs>
+    <ds:schemaRef ds:uri="http://schemas.microsoft.com/sharepoint/v3/contenttype/forms"/>
+  </ds:schemaRefs>
+</ds:datastoreItem>
+</file>
+
+<file path=customXml/itemProps3.xml><?xml version="1.0" encoding="utf-8"?>
+<ds:datastoreItem xmlns:ds="http://schemas.openxmlformats.org/officeDocument/2006/customXml" ds:itemID="{EAD7A3D4-D669-42A5-ADDB-03D9E33DB022}">
+  <ds:schemaRefs>
+    <ds:schemaRef ds:uri="http://schemas.microsoft.com/office/2006/metadata/properties"/>
+    <ds:schemaRef ds:uri="http://schemas.microsoft.com/office/infopath/2007/PartnerControls"/>
+    <ds:schemaRef ds:uri="e4d86ed8-65a8-471e-ab1f-c2478708fe07"/>
+    <ds:schemaRef ds:uri="53141595-342e-49bb-a682-90f2e9cbb543"/>
+  </ds:schemaRefs>
+</ds:datastoreItem>
 </file>
</xml_diff>